<commit_message>
Wetteksten gecontroleerd tegen primaire bronnen en gecorrigeerd
Cbw (Stb. 2026, 187) en Cyberbeveiligingsbesluit (Stb. 2026, 189): de wet vraagt beleid voor de toeleveringsketen en goedkeuring door het bestuur; 'wat er gebeurt bij contracteinde, faillissement of overname' is een advies van de RDI, geen wettekst. Bestuur: goedkeuren en aantoonbare kennis met trainingscertificaat, niet 'eindverantwoordelijk'. Toezicht: RDI, voor waterschappen ILT; aanwijzingen gelden niet voor overheidsinstanties (art. 79). Data Act: exportformaat is 'gestructureerd, algemeen gebruikt en machineleesbaar' (art. 30 lid 5), IaaS-aanbieders werken mee aan functionele gelijkwaardigheid. Cloudbeleid (26 643, nr. 1541): andere overheden wordt aangeraden het te volgen. Standaardclausules zijn een aanbeveling van november 2025; de ACM als toezichthouder staat in een wetsvoorstel. Bronnen en controledatum bijgewerkt.
</commit_message>
<xml_diff>
--- a/site/rapport/werkdocument-ravensmeer.docx
+++ b/site/rapport/werkdocument-ravensmeer.docx
@@ -2509,7 +2509,7 @@
       </w:pPr>
       <w:r>
         <w:rPr/>
-        <w:t xml:space="preserve">Onder de Cyberbeveiligingswet is de leiding van de organisatie verantwoordelijk voor de zorgplicht, ook voor de leveranciersketen. </w:t>
+        <w:t xml:space="preserve">Onder de Cyberbeveiligingswet moet het college de beveiligingsmaatregelen goedkeuren, ook die voor de leveranciersketen (art. 24 Cbw). </w:t>
       </w:r>
     </w:p>
     <w:p>
@@ -6403,7 +6403,7 @@
             </w:pPr>
             <w:r>
               <w:rPr/>
-              <w:t>Het contract beschrijft welke gegevens en configuraties exporteerbaar zijn, in welk open en machineleesbaar formaat.</w:t>
+              <w:t>Het contract beschrijft welke categorieën gegevens en digitale activa bij een overstap mee kunnen. Bij export in een gestructureerd, algemeen gebruikt en machineleesbaar formaat.</w:t>
             </w:r>
           </w:p>
         </w:tc>
@@ -6428,7 +6428,7 @@
             </w:pPr>
             <w:r>
               <w:rPr/>
-              <w:t>Volgt uit: Data Act, art. 25 en 30 (clouddiensten)</w:t>
+              <w:t>Volgt uit: Data Act, art. 25 lid 2 en art. 30 lid 5 (clouddiensten)</w:t>
             </w:r>
           </w:p>
         </w:tc>
@@ -6584,7 +6584,7 @@
             </w:pPr>
             <w:r>
               <w:rPr/>
-              <w:t>Eigen voorstel. Aanknopingspunt: zorgplicht leveranciersketen in de Cyberbeveiligingswet. Termijn en escrow volgen daar niet rechtstreeks uit.</w:t>
+              <w:t>Eigen voorstel. Aanknopingspunt: de RDI adviseert afspraken over gegevens en middelen bij contracteinde, faillissement of overname. Termijn en escrow volgen niet uit de wet.</w:t>
             </w:r>
           </w:p>
         </w:tc>

</xml_diff>